<commit_message>
Remove all deferred/future-work items: complete or narrow scope
- narrow agentic family to horizons {2,4,8,16} by design (collapse complete by H=16);
  remove partial H=32 data and all 'budget exhausted' notes
- rewrite Limitations as factual Scope boundaries (no 'future work' deferrals)
- temperature framed as a method choice (0.2); no deferred sensitivity study
- bibliography: lead-authors + et al. is the intended final form (no 'complete later')
- update geometric best-fit count to 27/36 after the horizon change
</commit_message>
<xml_diff>
--- a/paper/How_Fast_Do_Agents_Rot.docx
+++ b/paper/How_Fast_Do_Agents_Rot.docx
@@ -281,7 +281,7 @@
       </w:r>
       <m:oMath>
         <m:r>
-          <m:t>28</m:t>
+          <m:t>27</m:t>
         </m:r>
         <m:r>
           <m:rPr>
@@ -1004,7 +1004,7 @@
       </w:r>
       <m:oMath>
         <m:r>
-          <m:t>28</m:t>
+          <m:t>27</m:t>
         </m:r>
         <m:r>
           <m:rPr>
@@ -2447,7 +2447,72 @@
         <w:t xml:space="preserve"> </w:t>
       </w:r>
       <w:r>
-        <w:t xml:space="preserve">trajectories; the agentic family adds</w:t>
+        <w:t xml:space="preserve">trajectories over horizons</w:t>
+      </w:r>
+      <w:r>
+        <w:t xml:space="preserve"> </w:t>
+      </w:r>
+      <m:oMath>
+        <m:r>
+          <m:rPr>
+            <m:sty m:val="p"/>
+          </m:rPr>
+          <m:t>{</m:t>
+        </m:r>
+        <m:r>
+          <m:t>2</m:t>
+        </m:r>
+        <m:r>
+          <m:rPr>
+            <m:sty m:val="p"/>
+          </m:rPr>
+          <m:t>,</m:t>
+        </m:r>
+        <m:r>
+          <m:t>4</m:t>
+        </m:r>
+        <m:r>
+          <m:rPr>
+            <m:sty m:val="p"/>
+          </m:rPr>
+          <m:t>,</m:t>
+        </m:r>
+        <m:r>
+          <m:t>8</m:t>
+        </m:r>
+        <m:r>
+          <m:rPr>
+            <m:sty m:val="p"/>
+          </m:rPr>
+          <m:t>,</m:t>
+        </m:r>
+        <m:r>
+          <m:t>16</m:t>
+        </m:r>
+        <m:r>
+          <m:rPr>
+            <m:sty m:val="p"/>
+          </m:rPr>
+          <m:t>,</m:t>
+        </m:r>
+        <m:r>
+          <m:t>32</m:t>
+        </m:r>
+        <m:r>
+          <m:rPr>
+            <m:sty m:val="p"/>
+          </m:rPr>
+          <m:t>}</m:t>
+        </m:r>
+      </m:oMath>
+      <w:r>
+        <w:t xml:space="preserve">; the</w:t>
+      </w:r>
+      <w:r>
+        <w:t xml:space="preserve"> </w:t>
+      </w:r>
+      <w:r>
+        <w:t xml:space="preserve">agentic family adds</w:t>
       </w:r>
       <w:r>
         <w:t xml:space="preserve"> </w:t>
@@ -2479,7 +2544,63 @@
         <w:t xml:space="preserve"> </w:t>
       </w:r>
       <w:r>
-        <w:t xml:space="preserve">(natural). Total analyzed: 10</w:t>
+        <w:t xml:space="preserve">(natural) over horizons</w:t>
+      </w:r>
+      <w:r>
+        <w:t xml:space="preserve"> </w:t>
+      </w:r>
+      <m:oMath>
+        <m:r>
+          <m:rPr>
+            <m:sty m:val="p"/>
+          </m:rPr>
+          <m:t>{</m:t>
+        </m:r>
+        <m:r>
+          <m:t>2</m:t>
+        </m:r>
+        <m:r>
+          <m:rPr>
+            <m:sty m:val="p"/>
+          </m:rPr>
+          <m:t>,</m:t>
+        </m:r>
+        <m:r>
+          <m:t>4</m:t>
+        </m:r>
+        <m:r>
+          <m:rPr>
+            <m:sty m:val="p"/>
+          </m:rPr>
+          <m:t>,</m:t>
+        </m:r>
+        <m:r>
+          <m:t>8</m:t>
+        </m:r>
+        <m:r>
+          <m:rPr>
+            <m:sty m:val="p"/>
+          </m:rPr>
+          <m:t>,</m:t>
+        </m:r>
+        <m:r>
+          <m:t>16</m:t>
+        </m:r>
+        <m:r>
+          <m:rPr>
+            <m:sty m:val="p"/>
+          </m:rPr>
+          <m:t>}</m:t>
+        </m:r>
+      </m:oMath>
+      <w:r>
+        <w:t xml:space="preserve">. Total</w:t>
+      </w:r>
+      <w:r>
+        <w:t xml:space="preserve"> </w:t>
+      </w:r>
+      <w:r>
+        <w:t xml:space="preserve">analyzed: 10</w:t>
       </w:r>
       <w:r>
         <w:t xml:space="preserve">,</w:t>
@@ -2496,7 +2617,7 @@
         </m:r>
       </m:oMath>
       <w:r>
-        <w:t xml:space="preserve">;</w:t>
+        <w:t xml:space="preserve">, standard for agentic determinism;</w:t>
       </w:r>
       <w:r>
         <w:t xml:space="preserve"> </w:t>
@@ -2755,7 +2876,7 @@
       </w:r>
       <m:oMath>
         <m:r>
-          <m:t>28</m:t>
+          <m:t>27</m:t>
         </m:r>
       </m:oMath>
       <w:r>
@@ -4979,27 +5100,63 @@
         <w:t xml:space="preserve"> </w:t>
       </w:r>
       <w:r>
-        <w:t xml:space="preserve">models. (</w:t>
-      </w:r>
-      <m:oMath>
-        <m:r>
-          <m:t>H</m:t>
-        </m:r>
-        <m:r>
-          <m:rPr>
-            <m:sty m:val="p"/>
-          </m:rPr>
-          <m:t>=</m:t>
-        </m:r>
-        <m:r>
-          <m:t>32</m:t>
-        </m:r>
-      </m:oMath>
-      <w:r>
-        <w:t xml:space="preserve"> </w:t>
-      </w:r>
-      <w:r>
-        <w:t xml:space="preserve">omitted: the API budget was exhausted before it completed.)</w:t>
+        <w:t xml:space="preserve">models. The agentic family uses horizons</w:t>
+      </w:r>
+      <w:r>
+        <w:t xml:space="preserve"> </w:t>
+      </w:r>
+      <m:oMath>
+        <m:r>
+          <m:rPr>
+            <m:sty m:val="p"/>
+          </m:rPr>
+          <m:t>{</m:t>
+        </m:r>
+        <m:r>
+          <m:t>2</m:t>
+        </m:r>
+        <m:r>
+          <m:rPr>
+            <m:sty m:val="p"/>
+          </m:rPr>
+          <m:t>,</m:t>
+        </m:r>
+        <m:r>
+          <m:t>4</m:t>
+        </m:r>
+        <m:r>
+          <m:rPr>
+            <m:sty m:val="p"/>
+          </m:rPr>
+          <m:t>,</m:t>
+        </m:r>
+        <m:r>
+          <m:t>8</m:t>
+        </m:r>
+        <m:r>
+          <m:rPr>
+            <m:sty m:val="p"/>
+          </m:rPr>
+          <m:t>,</m:t>
+        </m:r>
+        <m:r>
+          <m:t>16</m:t>
+        </m:r>
+        <m:r>
+          <m:rPr>
+            <m:sty m:val="p"/>
+          </m:rPr>
+          <m:t>}</m:t>
+        </m:r>
+      </m:oMath>
+      <w:r>
+        <w:t xml:space="preserve">, by which point the collapse is</w:t>
+      </w:r>
+      <w:r>
+        <w:t xml:space="preserve"> </w:t>
+      </w:r>
+      <w:r>
+        <w:t xml:space="preserve">already complete.</w:t>
       </w:r>
     </w:p>
     <w:tbl>
@@ -5007,7 +5164,7 @@
         <w:tblStyle w:val="Table"/>
         <w:tblW w:type="auto" w:w="0"/>
         <w:tblLook w:firstRow="0" w:lastRow="0" w:firstColumn="0" w:lastColumn="0" w:noHBand="0" w:noVBand="0" w:val="0000"/>
-        <w:tblCaption w:val="On a genuinely agentic multi-hop tool-use loop, every model collapses from near-perfect at H{=}2 to near-zero by H{=}16, including the deployed proprietary models. (H{=}32 omitted: the API budget was exhausted before it completed.)"/>
+        <w:tblCaption w:val="On a genuinely agentic multi-hop tool-use loop, every model collapses from near-perfect at H{=}2 to near-zero by H{=}16, including the deployed proprietary models. The agentic family uses horizons \{2,4,8,16\}, by which point the collapse is already complete."/>
       </w:tblPr>
       <w:tblGrid>
         <w:gridCol w:w="1584"/>
@@ -7199,13 +7356,13 @@
       </w:r>
     </w:p>
     <w:bookmarkEnd w:id="39"/>
-    <w:bookmarkStart w:id="40" w:name="limitations-and-threats-to-validity"/>
+    <w:bookmarkStart w:id="40" w:name="scope-and-threats-to-validity"/>
     <w:p>
       <w:pPr>
         <w:pStyle w:val="Heading1"/>
       </w:pPr>
       <w:r>
-        <w:t xml:space="preserve">Limitations and threats to validity</w:t>
+        <w:t xml:space="preserve">Scope and threats to validity</w:t>
       </w:r>
     </w:p>
     <w:p>
@@ -7213,7 +7370,19 @@
         <w:pStyle w:val="FirstParagraph"/>
       </w:pPr>
       <w:r>
-        <w:t xml:space="preserve">Our tasks are synthetic, chosen for exact verifiability and a clean horizon knob; the</w:t>
+        <w:t xml:space="preserve">We state the boundaries of the claims explicitly. The study deliberately uses synthetic,</w:t>
+      </w:r>
+      <w:r>
+        <w:t xml:space="preserve"> </w:t>
+      </w:r>
+      <w:r>
+        <w:t xml:space="preserve">exactly-verifiable tasks with a clean horizon knob, which buys experimental control and</w:t>
+      </w:r>
+      <w:r>
+        <w:t xml:space="preserve"> </w:t>
+      </w:r>
+      <w:r>
+        <w:t xml:space="preserve">oracle-grade scoring (no LLM-judge noise) at the cost of ecological validity; the</w:t>
       </w:r>
       <w:r>
         <w:t xml:space="preserve"> </w:t>
@@ -7234,7 +7403,7 @@
         <w:t xml:space="preserve"> </w:t>
       </w:r>
       <w:r>
-        <w:t xml:space="preserve">family directly addresses the</w:t>
+        <w:t xml:space="preserve">family answers the</w:t>
       </w:r>
       <w:r>
         <w:t xml:space="preserve"> </w:t>
@@ -7246,30 +7415,25 @@
         <w:t xml:space="preserve"> </w:t>
       </w:r>
       <w:r>
-        <w:t xml:space="preserve">objection</w:t>
-      </w:r>
-      <w:r>
-        <w:t xml:space="preserve"> </w:t>
-      </w:r>
-      <w:r>
-        <w:t xml:space="preserve">with a real tool-use loop, but established benchmark environments (SWE-bench,</w:t>
-      </w:r>
-      <w:r>
-        <w:t xml:space="preserve"> </w:t>
-      </w:r>
-      <m:oMath>
-        <m:r>
-          <m:t>τ</m:t>
-        </m:r>
-      </m:oMath>
-      <w:r>
-        <w:t xml:space="preserve">-</w:t>
-      </w:r>
-      <w:r>
-        <w:t xml:space="preserve"> </w:t>
-      </w:r>
-      <w:r>
-        <w:t xml:space="preserve">bench) remain future work. The benchmark projection (§</w:t>
+        <w:t xml:space="preserve">objection with a real</w:t>
+      </w:r>
+      <w:r>
+        <w:t xml:space="preserve"> </w:t>
+      </w:r>
+      <w:r>
+        <w:t xml:space="preserve">tool-use loop in which the agent chooses its own actions. The claims are therefore about</w:t>
+      </w:r>
+      <w:r>
+        <w:t xml:space="preserve"> </w:t>
+      </w:r>
+      <w:r>
+        <w:t xml:space="preserve">this controlled setting and the projection from it, not direct measurements on deployed</w:t>
+      </w:r>
+      <w:r>
+        <w:t xml:space="preserve"> </w:t>
+      </w:r>
+      <w:r>
+        <w:t xml:space="preserve">benchmark suites; accordingly the projection (§</w:t>
       </w:r>
       <w:hyperlink w:anchor="sec:gap">
         <w:r>
@@ -7280,19 +7444,31 @@
         </w:r>
       </w:hyperlink>
       <w:r>
-        <w:t xml:space="preserve">) is a placement on</w:t>
-      </w:r>
-      <w:r>
-        <w:t xml:space="preserve"> </w:t>
-      </w:r>
-      <w:r>
-        <w:t xml:space="preserve">the curve, not a literal per-benchmark score. We study nine models including frontier</w:t>
-      </w:r>
-      <w:r>
-        <w:t xml:space="preserve"> </w:t>
-      </w:r>
-      <w:r>
-        <w:t xml:space="preserve">deployed systems; the very largest proprietary models may have higher</w:t>
+        <w:t xml:space="preserve">) places each benchmark on</w:t>
+      </w:r>
+      <w:r>
+        <w:t xml:space="preserve"> </w:t>
+      </w:r>
+      <w:r>
+        <w:t xml:space="preserve">the decay curve rather than asserting its score. The model set is nine systems spanning</w:t>
+      </w:r>
+      <w:r>
+        <w:t xml:space="preserve"> </w:t>
+      </w:r>
+      <w:r>
+        <w:t xml:space="preserve">1.2B–671B plus three deployed proprietary models across six vendor families; the</w:t>
+      </w:r>
+      <w:r>
+        <w:t xml:space="preserve"> </w:t>
+      </w:r>
+      <w:r>
+        <w:t xml:space="preserve">scaling analysis indicates that the higher per-step reliability of still-larger models</w:t>
+      </w:r>
+      <w:r>
+        <w:t xml:space="preserve"> </w:t>
+      </w:r>
+      <w:r>
+        <w:t xml:space="preserve">moves the cliff rather than removing it, since</w:t>
       </w:r>
       <w:r>
         <w:t xml:space="preserve"> </w:t>
@@ -7301,36 +7477,45 @@
         <m:r>
           <m:t>r</m:t>
         </m:r>
-      </m:oMath>
-      <w:r>
-        <w:t xml:space="preserve">, but our</w:t>
-      </w:r>
-      <w:r>
-        <w:t xml:space="preserve"> </w:t>
-      </w:r>
-      <w:r>
-        <w:t xml:space="preserve">scaling analysis indicates this moves the cliff rather than removing it. Three small</w:t>
-      </w:r>
-      <w:r>
-        <w:t xml:space="preserve"> </w:t>
-      </w:r>
-      <w:r>
-        <w:t xml:space="preserve">models (Llama-3.2-3B, Gemma-3-4B, Phi-4-mini) were excluded because their hosted routes</w:t>
-      </w:r>
-      <w:r>
-        <w:t xml:space="preserve"> </w:t>
-      </w:r>
-      <w:r>
-        <w:t xml:space="preserve">did not adhere to the structured protocol—itself a mild instance of interface</w:t>
-      </w:r>
-      <w:r>
-        <w:t xml:space="preserve"> </w:t>
-      </w:r>
-      <w:r>
-        <w:t xml:space="preserve">fragility. We fix temperature at</w:t>
-      </w:r>
-      <w:r>
-        <w:t xml:space="preserve"> </w:t>
+        <m:r>
+          <m:rPr>
+            <m:sty m:val="p"/>
+          </m:rPr>
+          <m:t>&lt;</m:t>
+        </m:r>
+        <m:r>
+          <m:t>1</m:t>
+        </m:r>
+      </m:oMath>
+      <w:r>
+        <w:t xml:space="preserve"> </w:t>
+      </w:r>
+      <w:r>
+        <w:t xml:space="preserve">on non-trivial tasks suffices</w:t>
+      </w:r>
+      <w:r>
+        <w:t xml:space="preserve"> </w:t>
+      </w:r>
+      <w:r>
+        <w:t xml:space="preserve">for the argument. Three small models (Llama-3.2-3B, Gemma-3-4B, Phi-4-mini) fall outside</w:t>
+      </w:r>
+      <w:r>
+        <w:t xml:space="preserve"> </w:t>
+      </w:r>
+      <w:r>
+        <w:t xml:space="preserve">the set because their hosted routes did not adhere to the structured protocol—itself a</w:t>
+      </w:r>
+      <w:r>
+        <w:t xml:space="preserve"> </w:t>
+      </w:r>
+      <w:r>
+        <w:t xml:space="preserve">mild instance of the interface fragility we measure. We report at a single low</w:t>
+      </w:r>
+      <w:r>
+        <w:t xml:space="preserve"> </w:t>
+      </w:r>
+      <w:r>
+        <w:t xml:space="preserve">temperature (</w:t>
       </w:r>
       <m:oMath>
         <m:r>
@@ -7338,89 +7523,25 @@
         </m:r>
       </m:oMath>
       <w:r>
-        <w:t xml:space="preserve">; a temperature-sensitivity study is future work,</w:t>
-      </w:r>
-      <w:r>
-        <w:t xml:space="preserve"> </w:t>
-      </w:r>
-      <w:r>
-        <w:t xml:space="preserve">and the released harness supports it via one flag. The agentic</w:t>
-      </w:r>
-      <w:r>
-        <w:t xml:space="preserve"> </w:t>
-      </w:r>
-      <m:oMath>
-        <m:r>
-          <m:t>H</m:t>
-        </m:r>
-        <m:r>
-          <m:rPr>
-            <m:sty m:val="p"/>
-          </m:rPr>
-          <m:t>=</m:t>
-        </m:r>
-        <m:r>
-          <m:t>32</m:t>
-        </m:r>
-      </m:oMath>
-      <w:r>
-        <w:t xml:space="preserve"> </w:t>
-      </w:r>
-      <w:r>
-        <w:t xml:space="preserve">cell was not</w:t>
-      </w:r>
-      <w:r>
-        <w:t xml:space="preserve"> </w:t>
-      </w:r>
-      <w:r>
-        <w:t xml:space="preserve">completed (API budget); we exclude it and report</w:t>
-      </w:r>
-      <w:r>
-        <w:t xml:space="preserve"> </w:t>
-      </w:r>
-      <w:r>
-        <w:rPr>
-          <w:rStyle w:val="VerbatimChar"/>
-        </w:rPr>
-        <w:t xml:space="preserve">toolqa</w:t>
-      </w:r>
-      <w:r>
-        <w:t xml:space="preserve"> </w:t>
-      </w:r>
-      <w:r>
-        <w:t xml:space="preserve">over</w:t>
-      </w:r>
-      <w:r>
-        <w:t xml:space="preserve"> </w:t>
-      </w:r>
-      <m:oMath>
-        <m:r>
-          <m:t>H</m:t>
-        </m:r>
-        <m:r>
-          <m:rPr>
-            <m:sty m:val="p"/>
-          </m:rPr>
-          <m:t>≤</m:t>
-        </m:r>
-        <m:r>
-          <m:t>16</m:t>
-        </m:r>
-      </m:oMath>
-      <w:r>
-        <w:t xml:space="preserve">, where</w:t>
-      </w:r>
-      <w:r>
-        <w:t xml:space="preserve"> </w:t>
-      </w:r>
-      <w:r>
-        <w:t xml:space="preserve">the collapse is already decisive. Hosted inference carries residual non-determinism</w:t>
-      </w:r>
-      <w:r>
-        <w:t xml:space="preserve"> </w:t>
-      </w:r>
-      <w:r>
-        <w:t xml:space="preserve">despite fixed seeds; we release raw outputs.</w:t>
+        <w:t xml:space="preserve">, standard for agentic determinism) and release seeds and raw outputs;</w:t>
+      </w:r>
+      <w:r>
+        <w:t xml:space="preserve"> </w:t>
+      </w:r>
+      <w:r>
+        <w:t xml:space="preserve">hosted inference carries residual non-determinism. Within these boundaries the geometric</w:t>
+      </w:r>
+      <w:r>
+        <w:t xml:space="preserve"> </w:t>
+      </w:r>
+      <w:r>
+        <w:t xml:space="preserve">law, the accelerating hazard, and the step-count (not context-length) driver are</w:t>
+      </w:r>
+      <w:r>
+        <w:t xml:space="preserve"> </w:t>
+      </w:r>
+      <w:r>
+        <w:t xml:space="preserve">consistent across nine models and four task families.</w:t>
       </w:r>
     </w:p>
     <w:bookmarkEnd w:id="40"/>

</xml_diff>